<commit_message>
Rebrand to The Language Centre; add logo to login; update docs
- Add TLC logo to login page, replace title text with branded name
- Change "TLC English" → "The Language Centre" across all files
  (login, signup, email notifications, doc generator)
- Update Word doc with new features: student class-code login,
  teacher-created accounts with passwords, TTS, new settings

Co-Authored-By: Claude Sonnet 4.6 <noreply@anthropic.com>
</commit_message>
<xml_diff>
--- a/TLC_App_Guide.docx
+++ b/TLC_App_Guide.docx
@@ -66,7 +66,7 @@
           <w:sz w:val="64"/>
           <w:szCs w:val="64"/>
         </w:rPr>
-        <w:t xml:space="preserve">TLC English App</w:t>
+        <w:t xml:space="preserve">The Language Centre App</w:t>
       </w:r>
     </w:p>
     <w:p>
@@ -172,7 +172,7 @@
           <w:sz w:val="22"/>
           <w:szCs w:val="22"/>
         </w:rPr>
-        <w:t xml:space="preserve">TLC English is a web application built for English teachers working with Japanese students. It replaces scattered spreadsheets, messaging apps, and paper notes with a single centralised platform for lesson management, student tracking, vocabulary learning, and scheduling.
+        <w:t xml:space="preserve">The Language Centre is a web application built for English teachers working with Japanese students. It replaces scattered spreadsheets, messaging apps, and paper notes with a single centralised platform for lesson management, student tracking, vocabulary learning, and scheduling.
 </w:t>
       </w:r>
     </w:p>
@@ -288,7 +288,7 @@
           <w:sz w:val="26"/>
           <w:szCs w:val="26"/>
         </w:rPr>
-        <w:t xml:space="preserve">Connecting a Teacher and Student</w:t>
+        <w:t xml:space="preserve">Student Login — Two Options</w:t>
       </w:r>
     </w:p>
     <w:p>
@@ -301,7 +301,7 @@
           <w:sz w:val="22"/>
           <w:szCs w:val="22"/>
         </w:rPr>
-        <w:t xml:space="preserve">After signing up, a teacher and student must be linked before most features become available.</w:t>
+        <w:t xml:space="preserve">Students can log in in two ways, depending on whether they have an email address:</w:t>
       </w:r>
     </w:p>
     <w:tbl>
@@ -343,7 +343,7 @@
                 <w:sz w:val="20"/>
                 <w:szCs w:val="20"/>
               </w:rPr>
-              <w:t xml:space="preserve">Teacher</w:t>
+              <w:t xml:space="preserve">Option A — Class Code (young students)</w:t>
             </w:r>
           </w:p>
         </w:tc>
@@ -362,7 +362,174 @@
                 <w:sz w:val="22"/>
                 <w:szCs w:val="22"/>
               </w:rPr>
-              <w:t xml:space="preserve">A unique 6-character invite code is automatically generated (e.g. AB3K9X). Find it on the Students page or in Settings, then share it with your student by text or email.</w:t>
+              <w:t xml:space="preserve">The student enters the teacher's 6-character class code on the login screen, selects their name from a dropdown, and enters their password. No email required. The teacher creates the account and sets the initial password from the Students page.</w:t>
+            </w:r>
+          </w:p>
+        </w:tc>
+      </w:tr>
+    </w:tbl>
+    <w:p>
+      <w:pPr>
+        <w:spacing w:after="120"/>
+      </w:pPr>
+    </w:p>
+    <w:tbl>
+      <w:tblPr>
+        <w:tblW w:type="pct" w:w="100%"/>
+        <w:tblBorders>
+          <w:top w:val="single" w:color="auto" w:sz="4"/>
+          <w:left w:val="single" w:color="auto" w:sz="4"/>
+          <w:bottom w:val="single" w:color="auto" w:sz="4"/>
+          <w:right w:val="single" w:color="auto" w:sz="4"/>
+          <w:insideH w:val="single" w:color="auto" w:sz="4"/>
+          <w:insideV w:val="single" w:color="auto" w:sz="4"/>
+        </w:tblBorders>
+        <w:tblCellMar>
+          <w:top w:type="dxa" w:w="100"/>
+          <w:bottom w:type="dxa" w:w="200"/>
+        </w:tblCellMar>
+      </w:tblPr>
+      <w:tblGrid>
+        <w:gridCol w:w="100"/>
+        <w:gridCol w:w="100"/>
+      </w:tblGrid>
+      <w:tr>
+        <w:tc>
+          <w:tcPr>
+            <w:tcW w:type="pct" w:w="15%"/>
+            <w:shd w:color="02508E" w:val="solid"/>
+          </w:tcPr>
+          <w:p>
+            <w:pPr>
+              <w:spacing w:after="80" w:before="80"/>
+              <w:jc w:val="center"/>
+            </w:pPr>
+            <w:r>
+              <w:rPr>
+                <w:b/>
+                <w:bCs/>
+                <w:color w:val="FFFFFF"/>
+                <w:sz w:val="20"/>
+                <w:szCs w:val="20"/>
+              </w:rPr>
+              <w:t xml:space="preserve">Option B — Email signup (adult students)</w:t>
+            </w:r>
+          </w:p>
+        </w:tc>
+        <w:tc>
+          <w:tcPr>
+            <w:tcW w:type="pct" w:w="85%"/>
+            <w:shd w:color="E8F2FA" w:val="solid"/>
+          </w:tcPr>
+          <w:p>
+            <w:pPr>
+              <w:spacing w:after="60" w:before="60"/>
+            </w:pPr>
+            <w:r>
+              <w:rPr>
+                <w:color w:val="111827"/>
+                <w:sz w:val="22"/>
+                <w:szCs w:val="22"/>
+              </w:rPr>
+              <w:t xml:space="preserve">Students sign up with their own email address, then go to Settings → Join a Teacher and enter the class code to link their account.</w:t>
+            </w:r>
+          </w:p>
+        </w:tc>
+      </w:tr>
+    </w:tbl>
+    <w:p>
+      <w:pPr>
+        <w:spacing w:after="120"/>
+      </w:pPr>
+    </w:p>
+    <w:p>
+      <w:pPr>
+        <w:pStyle w:val="Heading2"/>
+        <w:spacing w:after="120" w:before="300"/>
+      </w:pPr>
+      <w:r>
+        <w:rPr>
+          <w:b/>
+          <w:bCs/>
+          <w:color w:val="111827"/>
+          <w:sz w:val="26"/>
+          <w:szCs w:val="26"/>
+        </w:rPr>
+        <w:t xml:space="preserve">Connecting a Teacher and Student (adult/email flow)</w:t>
+      </w:r>
+    </w:p>
+    <w:p>
+      <w:pPr>
+        <w:spacing w:after="120"/>
+      </w:pPr>
+      <w:r>
+        <w:rPr>
+          <w:color w:val="111827"/>
+          <w:sz w:val="22"/>
+          <w:szCs w:val="22"/>
+        </w:rPr>
+        <w:t xml:space="preserve">After signing up with an email, a student must be linked to their teacher before most features become available.</w:t>
+      </w:r>
+    </w:p>
+    <w:tbl>
+      <w:tblPr>
+        <w:tblW w:type="pct" w:w="100%"/>
+        <w:tblBorders>
+          <w:top w:val="single" w:color="auto" w:sz="4"/>
+          <w:left w:val="single" w:color="auto" w:sz="4"/>
+          <w:bottom w:val="single" w:color="auto" w:sz="4"/>
+          <w:right w:val="single" w:color="auto" w:sz="4"/>
+          <w:insideH w:val="single" w:color="auto" w:sz="4"/>
+          <w:insideV w:val="single" w:color="auto" w:sz="4"/>
+        </w:tblBorders>
+        <w:tblCellMar>
+          <w:top w:type="dxa" w:w="100"/>
+          <w:bottom w:type="dxa" w:w="200"/>
+        </w:tblCellMar>
+      </w:tblPr>
+      <w:tblGrid>
+        <w:gridCol w:w="100"/>
+        <w:gridCol w:w="100"/>
+      </w:tblGrid>
+      <w:tr>
+        <w:tc>
+          <w:tcPr>
+            <w:tcW w:type="pct" w:w="15%"/>
+            <w:shd w:color="02508E" w:val="solid"/>
+          </w:tcPr>
+          <w:p>
+            <w:pPr>
+              <w:spacing w:after="80" w:before="80"/>
+              <w:jc w:val="center"/>
+            </w:pPr>
+            <w:r>
+              <w:rPr>
+                <w:b/>
+                <w:bCs/>
+                <w:color w:val="FFFFFF"/>
+                <w:sz w:val="20"/>
+                <w:szCs w:val="20"/>
+              </w:rPr>
+              <w:t xml:space="preserve">Teacher</w:t>
+            </w:r>
+          </w:p>
+        </w:tc>
+        <w:tc>
+          <w:tcPr>
+            <w:tcW w:type="pct" w:w="85%"/>
+            <w:shd w:color="E8F2FA" w:val="solid"/>
+          </w:tcPr>
+          <w:p>
+            <w:pPr>
+              <w:spacing w:after="60" w:before="60"/>
+            </w:pPr>
+            <w:r>
+              <w:rPr>
+                <w:color w:val="111827"/>
+                <w:sz w:val="22"/>
+                <w:szCs w:val="22"/>
+              </w:rPr>
+              <w:t xml:space="preserve">A unique 6-character invite code is automatically generated (e.g. AB3K9X). Find it on the Students page or in Settings, then share it with your student.</w:t>
             </w:r>
           </w:p>
         </w:tc>
@@ -850,7 +1017,7 @@
           <w:sz w:val="23"/>
           <w:szCs w:val="23"/>
         </w:rPr>
-        <w:t xml:space="preserve">Placeholder Students</w:t>
+        <w:t xml:space="preserve">Adding Students (Teacher-Created Accounts)</w:t>
       </w:r>
     </w:p>
     <w:p>
@@ -863,97 +1030,79 @@
           <w:sz w:val="22"/>
           <w:szCs w:val="22"/>
         </w:rPr>
-        <w:t xml:space="preserve">You can add students to your roster before they create an account — useful for building your schedule on day one.</w:t>
-      </w:r>
-    </w:p>
-    <w:p>
-      <w:pPr>
-        <w:pStyle w:val="ListParagraph"/>
-        <w:numPr>
-          <w:ilvl w:val="0"/>
-          <w:numId w:val="1"/>
-        </w:numPr>
-        <w:spacing w:after="80"/>
-      </w:pPr>
-      <w:r>
-        <w:rPr>
-          <w:color w:val="111827"/>
-          <w:sz w:val="22"/>
-          <w:szCs w:val="22"/>
-        </w:rPr>
-        <w:t xml:space="preserve">Click "+ Add Student" and enter the student's name</w:t>
-      </w:r>
-    </w:p>
-    <w:p>
-      <w:pPr>
-        <w:pStyle w:val="ListParagraph"/>
-        <w:numPr>
-          <w:ilvl w:val="0"/>
-          <w:numId w:val="1"/>
-        </w:numPr>
-        <w:spacing w:after="80"/>
-      </w:pPr>
-      <w:r>
-        <w:rPr>
-          <w:color w:val="111827"/>
-          <w:sz w:val="22"/>
-          <w:szCs w:val="22"/>
-        </w:rPr>
-        <w:t xml:space="preserve">A placeholder card is created immediately with a dashed border and amber "Placeholder" badge</w:t>
-      </w:r>
-    </w:p>
-    <w:p>
-      <w:pPr>
-        <w:pStyle w:val="ListParagraph"/>
-        <w:numPr>
-          <w:ilvl w:val="0"/>
-          <w:numId w:val="1"/>
-        </w:numPr>
-        <w:spacing w:after="80"/>
-      </w:pPr>
-      <w:r>
-        <w:rPr>
-          <w:color w:val="111827"/>
-          <w:sz w:val="22"/>
-          <w:szCs w:val="22"/>
-        </w:rPr>
-        <w:t xml:space="preserve">Schedule lessons against the placeholder just like a real student</w:t>
-      </w:r>
-    </w:p>
-    <w:p>
-      <w:pPr>
-        <w:pStyle w:val="ListParagraph"/>
-        <w:numPr>
-          <w:ilvl w:val="0"/>
-          <w:numId w:val="1"/>
-        </w:numPr>
-        <w:spacing w:after="80"/>
-      </w:pPr>
-      <w:r>
-        <w:rPr>
-          <w:color w:val="111827"/>
-          <w:sz w:val="22"/>
-          <w:szCs w:val="22"/>
-        </w:rPr>
-        <w:t xml:space="preserve">When the student signs up, click "Link to real account" on their card, enter their email address, and all lessons and data transfer instantly to their real account</w:t>
-      </w:r>
-    </w:p>
-    <w:p>
-      <w:pPr>
-        <w:pStyle w:val="ListParagraph"/>
-        <w:numPr>
-          <w:ilvl w:val="0"/>
-          <w:numId w:val="1"/>
-        </w:numPr>
-        <w:spacing w:after="80"/>
-      </w:pPr>
-      <w:r>
-        <w:rPr>
-          <w:color w:val="111827"/>
-          <w:sz w:val="22"/>
-          <w:szCs w:val="22"/>
-        </w:rPr>
-        <w:t xml:space="preserve">The placeholder is removed automatically after linking</w:t>
+        <w:t xml:space="preserve">Teachers can add students directly — ideal for young learners who don't have an email address.</w:t>
+      </w:r>
+    </w:p>
+    <w:p>
+      <w:pPr>
+        <w:pStyle w:val="ListParagraph"/>
+        <w:numPr>
+          <w:ilvl w:val="0"/>
+          <w:numId w:val="1"/>
+        </w:numPr>
+        <w:spacing w:after="80"/>
+      </w:pPr>
+      <w:r>
+        <w:rPr>
+          <w:color w:val="111827"/>
+          <w:sz w:val="22"/>
+          <w:szCs w:val="22"/>
+        </w:rPr>
+        <w:t xml:space="preserve">Click "+ Add Student", enter the student's name and an initial password</w:t>
+      </w:r>
+    </w:p>
+    <w:p>
+      <w:pPr>
+        <w:pStyle w:val="ListParagraph"/>
+        <w:numPr>
+          <w:ilvl w:val="0"/>
+          <w:numId w:val="1"/>
+        </w:numPr>
+        <w:spacing w:after="80"/>
+      </w:pPr>
+      <w:r>
+        <w:rPr>
+          <w:color w:val="111827"/>
+          <w:sz w:val="22"/>
+          <w:szCs w:val="22"/>
+        </w:rPr>
+        <w:t xml:space="preserve">The student can now log in immediately using the class code + name + password method</w:t>
+      </w:r>
+    </w:p>
+    <w:p>
+      <w:pPr>
+        <w:pStyle w:val="ListParagraph"/>
+        <w:numPr>
+          <w:ilvl w:val="0"/>
+          <w:numId w:val="1"/>
+        </w:numPr>
+        <w:spacing w:after="80"/>
+      </w:pPr>
+      <w:r>
+        <w:rPr>
+          <w:color w:val="111827"/>
+          <w:sz w:val="22"/>
+          <w:szCs w:val="22"/>
+        </w:rPr>
+        <w:t xml:space="preserve">From the student's card, click "Set Password" at any time to reset their login password</w:t>
+      </w:r>
+    </w:p>
+    <w:p>
+      <w:pPr>
+        <w:pStyle w:val="ListParagraph"/>
+        <w:numPr>
+          <w:ilvl w:val="0"/>
+          <w:numId w:val="1"/>
+        </w:numPr>
+        <w:spacing w:after="80"/>
+      </w:pPr>
+      <w:r>
+        <w:rPr>
+          <w:color w:val="111827"/>
+          <w:sz w:val="22"/>
+          <w:szCs w:val="22"/>
+        </w:rPr>
+        <w:t xml:space="preserve">If the student later creates their own email account, click "Link Email →" on their card, enter their email, and all lessons and data transfer to their real account</w:t>
       </w:r>
     </w:p>
     <w:p>
@@ -1000,7 +1149,7 @@
                 <w:sz w:val="20"/>
                 <w:szCs w:val="20"/>
               </w:rPr>
-              <w:t xml:space="preserve">Note</w:t>
+              <w:t xml:space="preserve">Class Code</w:t>
             </w:r>
           </w:p>
         </w:tc>
@@ -1019,7 +1168,7 @@
                 <w:sz w:val="22"/>
                 <w:szCs w:val="22"/>
               </w:rPr>
-              <w:t xml:space="preserve">Placeholder students cannot log in to the app. They are a scheduling tool only. Once linked to a real account, the student gains full access to all their lesson history, vocabulary, and goals.</w:t>
+              <w:t xml:space="preserve">The class code displayed at the top of the Students page is what students enter on the login screen. Students with teacher-created accounts use: Class Code → select name → enter password.</w:t>
             </w:r>
           </w:p>
         </w:tc>
@@ -3281,6 +3430,37 @@
           <w:sz w:val="23"/>
           <w:szCs w:val="23"/>
         </w:rPr>
+        <w:t xml:space="preserve">Text-to-Speech (TTS)</w:t>
+      </w:r>
+    </w:p>
+    <w:p>
+      <w:pPr>
+        <w:spacing w:after="120"/>
+      </w:pPr>
+      <w:r>
+        <w:rPr>
+          <w:color w:val="111827"/>
+          <w:sz w:val="22"/>
+          <w:szCs w:val="22"/>
+        </w:rPr>
+        <w:t xml:space="preserve">Every vocabulary word has a 🔊 speaker button. Tap it to hear the word read aloud in English. In Study Session mode, the word is automatically spoken when each new card appears (can be turned off in Settings).</w:t>
+      </w:r>
+    </w:p>
+    <w:p>
+      <w:pPr>
+        <w:pStyle w:val="Heading3"/>
+        <w:spacing w:after="80" w:before="200"/>
+      </w:pPr>
+      <w:r>
+        <w:rPr>
+          <w:b/>
+          <w:bCs/>
+          <w:i/>
+          <w:iCs/>
+          <w:color w:val="02508E"/>
+          <w:sz w:val="23"/>
+          <w:szCs w:val="23"/>
+        </w:rPr>
         <w:t xml:space="preserve">Flashcard Review</w:t>
       </w:r>
     </w:p>
@@ -4161,6 +4341,42 @@
     </w:p>
     <w:p>
       <w:pPr>
+        <w:pStyle w:val="ListParagraph"/>
+        <w:numPr>
+          <w:ilvl w:val="0"/>
+          <w:numId w:val="1"/>
+        </w:numPr>
+        <w:spacing w:after="80"/>
+      </w:pPr>
+      <w:r>
+        <w:rPr>
+          <w:color w:val="111827"/>
+          <w:sz w:val="22"/>
+          <w:szCs w:val="22"/>
+        </w:rPr>
+        <w:t xml:space="preserve">Toggle email notifications on/off</w:t>
+      </w:r>
+    </w:p>
+    <w:p>
+      <w:pPr>
+        <w:pStyle w:val="ListParagraph"/>
+        <w:numPr>
+          <w:ilvl w:val="0"/>
+          <w:numId w:val="1"/>
+        </w:numPr>
+        <w:spacing w:after="80"/>
+      </w:pPr>
+      <w:r>
+        <w:rPr>
+          <w:color w:val="111827"/>
+          <w:sz w:val="22"/>
+          <w:szCs w:val="22"/>
+        </w:rPr>
+        <w:t xml:space="preserve">Set default lesson duration (30 min / 45 min / 1 hour / 90 min / 2 hours) — auto-fills end time when scheduling</w:t>
+      </w:r>
+    </w:p>
+    <w:p>
+      <w:pPr>
         <w:pStyle w:val="Heading2"/>
         <w:spacing w:after="120" w:before="300"/>
       </w:pPr>
@@ -4227,6 +4443,60 @@
           <w:szCs w:val="22"/>
         </w:rPr>
         <w:t xml:space="preserve">Join a teacher using their 6-character invite code</w:t>
+      </w:r>
+    </w:p>
+    <w:p>
+      <w:pPr>
+        <w:pStyle w:val="ListParagraph"/>
+        <w:numPr>
+          <w:ilvl w:val="0"/>
+          <w:numId w:val="1"/>
+        </w:numPr>
+        <w:spacing w:after="80"/>
+      </w:pPr>
+      <w:r>
+        <w:rPr>
+          <w:color w:val="111827"/>
+          <w:sz w:val="22"/>
+          <w:szCs w:val="22"/>
+        </w:rPr>
+        <w:t xml:space="preserve">Toggle email notifications on/off</w:t>
+      </w:r>
+    </w:p>
+    <w:p>
+      <w:pPr>
+        <w:pStyle w:val="ListParagraph"/>
+        <w:numPr>
+          <w:ilvl w:val="0"/>
+          <w:numId w:val="1"/>
+        </w:numPr>
+        <w:spacing w:after="80"/>
+      </w:pPr>
+      <w:r>
+        <w:rPr>
+          <w:color w:val="111827"/>
+          <w:sz w:val="22"/>
+          <w:szCs w:val="22"/>
+        </w:rPr>
+        <w:t xml:space="preserve">Toggle vocabulary TTS (text-to-speech) auto-play on/off</w:t>
+      </w:r>
+    </w:p>
+    <w:p>
+      <w:pPr>
+        <w:pStyle w:val="ListParagraph"/>
+        <w:numPr>
+          <w:ilvl w:val="0"/>
+          <w:numId w:val="1"/>
+        </w:numPr>
+        <w:spacing w:after="80"/>
+      </w:pPr>
+      <w:r>
+        <w:rPr>
+          <w:color w:val="111827"/>
+          <w:sz w:val="22"/>
+          <w:szCs w:val="22"/>
+        </w:rPr>
+        <w:t xml:space="preserve">Set study session size (10 / 20 / 30 / all words per session)</w:t>
       </w:r>
     </w:p>
     <w:p>
@@ -4694,7 +4964,7 @@
         <w:sz w:val="16"/>
         <w:szCs w:val="16"/>
       </w:rPr>
-      <w:t xml:space="preserve">TLC English · Confidential  </w:t>
+      <w:t xml:space="preserve">The Language Centre · Confidential  </w:t>
     </w:r>
     <w:r>
       <w:rPr>
@@ -4821,7 +5091,7 @@
         <w:sz w:val="18"/>
         <w:szCs w:val="18"/>
       </w:rPr>
-      <w:t xml:space="preserve">  |  TLC English App — Feature Guide</w:t>
+      <w:t xml:space="preserve">  |  The Language Centre App — Feature Guide</w:t>
     </w:r>
   </w:p>
 </w:hdr>

</xml_diff>

<commit_message>
Fix #9 #11 #13 #14 #15 #16 #17 #18 from audit list
#9 - Vocabulary search: filter bar searches word/definition_en/definition_ja, shows no-results state
#11 - Avatar nav: key={avatar_url} forces img remount on URL change; SettingsPage syncs preview with profile on load
#13 - Delete entire orphaned src/app/ directory (dead Next.js files in Vite project)
#14 - Fix Cancel Lesson button visible to students (added isTeacher guard); remove hardcoded JST timezone label
#15 - Students list search: filter by name or email
#16 - Booking pending requests: show each request date/time, not just a count
#17 - PDF export for students: Save PDF button shown when student has lesson notes
#18 - Grammar empty state: add 📖 emoji and better spacing

Co-Authored-By: Claude Sonnet 4.6 <noreply@anthropic.com>
</commit_message>
<xml_diff>
--- a/TLC_App_Guide.docx
+++ b/TLC_App_Guide.docx
@@ -1295,63 +1295,450 @@
           <w:sz w:val="23"/>
           <w:szCs w:val="23"/>
         </w:rPr>
-        <w:t xml:space="preserve">Goals</w:t>
-      </w:r>
-    </w:p>
-    <w:p>
-      <w:pPr>
-        <w:pStyle w:val="ListParagraph"/>
-        <w:numPr>
-          <w:ilvl w:val="0"/>
-          <w:numId w:val="1"/>
-        </w:numPr>
-        <w:spacing w:after="80"/>
-      </w:pPr>
-      <w:r>
-        <w:rPr>
-          <w:color w:val="111827"/>
-          <w:sz w:val="22"/>
-          <w:szCs w:val="22"/>
-        </w:rPr>
-        <w:t xml:space="preserve">Full list of learning goals with title, target date, days remaining (or overdue), and status</w:t>
-      </w:r>
-    </w:p>
-    <w:p>
-      <w:pPr>
-        <w:pStyle w:val="ListParagraph"/>
-        <w:numPr>
-          <w:ilvl w:val="0"/>
-          <w:numId w:val="1"/>
-        </w:numPr>
-        <w:spacing w:after="80"/>
-      </w:pPr>
-      <w:r>
-        <w:rPr>
-          <w:color w:val="111827"/>
-          <w:sz w:val="22"/>
-          <w:szCs w:val="22"/>
-        </w:rPr>
-        <w:t xml:space="preserve">Status options: Active / Achieved / Paused / Dropped</w:t>
-      </w:r>
-    </w:p>
-    <w:p>
-      <w:pPr>
-        <w:pStyle w:val="ListParagraph"/>
-        <w:numPr>
-          <w:ilvl w:val="0"/>
-          <w:numId w:val="1"/>
-        </w:numPr>
-        <w:spacing w:after="80"/>
-      </w:pPr>
-      <w:r>
-        <w:rPr>
-          <w:color w:val="111827"/>
-          <w:sz w:val="22"/>
-          <w:szCs w:val="22"/>
-        </w:rPr>
-        <w:t xml:space="preserve">Add new goals with title, optional description, and optional target date</w:t>
-      </w:r>
-    </w:p>
+        <w:t xml:space="preserve">Profile</w:t>
+      </w:r>
+    </w:p>
+    <w:p>
+      <w:pPr>
+        <w:spacing w:after="120"/>
+      </w:pPr>
+      <w:r>
+        <w:rPr>
+          <w:color w:val="111827"/>
+          <w:sz w:val="22"/>
+          <w:szCs w:val="22"/>
+        </w:rPr>
+        <w:t xml:space="preserve">Extended background information about the student — managed by the teacher. Click the Edit button on the Profile card to fill in or update any fields.</w:t>
+      </w:r>
+    </w:p>
+    <w:tbl>
+      <w:tblPr>
+        <w:tblW w:type="pct" w:w="100%"/>
+        <w:tblBorders>
+          <w:top w:val="single" w:color="auto" w:sz="4"/>
+          <w:left w:val="single" w:color="auto" w:sz="4"/>
+          <w:bottom w:val="single" w:color="auto" w:sz="4"/>
+          <w:right w:val="single" w:color="auto" w:sz="4"/>
+          <w:insideH w:val="single" w:color="auto" w:sz="4"/>
+          <w:insideV w:val="single" w:color="auto" w:sz="4"/>
+        </w:tblBorders>
+        <w:tblCellMar>
+          <w:top w:type="dxa" w:w="0"/>
+          <w:bottom w:type="dxa" w:w="240"/>
+        </w:tblCellMar>
+      </w:tblPr>
+      <w:tblGrid>
+        <w:gridCol w:w="100"/>
+        <w:gridCol w:w="100"/>
+      </w:tblGrid>
+      <w:tr>
+        <w:trPr>
+          <w:tblHeader/>
+        </w:trPr>
+        <w:tc>
+          <w:tcPr>
+            <w:tcW w:type="pct" w:w="30%"/>
+            <w:shd w:color="02508E" w:val="solid"/>
+          </w:tcPr>
+          <w:p>
+            <w:pPr>
+              <w:spacing w:after="80" w:before="80"/>
+            </w:pPr>
+            <w:r>
+              <w:rPr>
+                <w:b/>
+                <w:bCs/>
+                <w:color w:val="FFFFFF"/>
+                <w:sz w:val="20"/>
+                <w:szCs w:val="20"/>
+              </w:rPr>
+              <w:t xml:space="preserve">Feature</w:t>
+            </w:r>
+          </w:p>
+        </w:tc>
+        <w:tc>
+          <w:tcPr>
+            <w:tcW w:type="pct" w:w="70%"/>
+            <w:shd w:color="02508E" w:val="solid"/>
+          </w:tcPr>
+          <w:p>
+            <w:pPr>
+              <w:spacing w:after="80" w:before="80"/>
+            </w:pPr>
+            <w:r>
+              <w:rPr>
+                <w:b/>
+                <w:bCs/>
+                <w:color w:val="FFFFFF"/>
+                <w:sz w:val="20"/>
+                <w:szCs w:val="20"/>
+              </w:rPr>
+              <w:t xml:space="preserve">Description</w:t>
+            </w:r>
+          </w:p>
+        </w:tc>
+      </w:tr>
+      <w:tr>
+        <w:tc>
+          <w:tcPr>
+            <w:shd w:color="E8F2FA" w:val="solid"/>
+          </w:tcPr>
+          <w:p>
+            <w:pPr>
+              <w:spacing w:after="60" w:before="60"/>
+            </w:pPr>
+            <w:r>
+              <w:rPr>
+                <w:b/>
+                <w:bCs/>
+                <w:color w:val="02508E"/>
+                <w:sz w:val="20"/>
+                <w:szCs w:val="20"/>
+              </w:rPr>
+              <w:t xml:space="preserve">Age &amp; Grade</w:t>
+            </w:r>
+          </w:p>
+        </w:tc>
+        <w:tc>
+          <w:tcPr>
+            <w:shd w:color="E8F2FA" w:val="solid"/>
+          </w:tcPr>
+          <w:p>
+            <w:pPr>
+              <w:spacing w:after="60" w:before="60"/>
+            </w:pPr>
+            <w:r>
+              <w:rPr>
+                <w:color w:val="111827"/>
+                <w:sz w:val="22"/>
+                <w:szCs w:val="22"/>
+              </w:rPr>
+              <w:t xml:space="preserve">Student's age and school grade (Elementary 1–6, Middle 1–3, High 1–3, University, Adult)</w:t>
+            </w:r>
+          </w:p>
+        </w:tc>
+      </w:tr>
+      <w:tr>
+        <w:tc>
+          <w:tcPr>
+            <w:shd w:color="FFFFFF" w:val="solid"/>
+          </w:tcPr>
+          <w:p>
+            <w:pPr>
+              <w:spacing w:after="60" w:before="60"/>
+            </w:pPr>
+            <w:r>
+              <w:rPr>
+                <w:b/>
+                <w:bCs/>
+                <w:color w:val="02508E"/>
+                <w:sz w:val="20"/>
+                <w:szCs w:val="20"/>
+              </w:rPr>
+              <w:t xml:space="preserve">School / Occupation</w:t>
+            </w:r>
+          </w:p>
+        </w:tc>
+        <w:tc>
+          <w:tcPr>
+            <w:shd w:color="FFFFFF" w:val="solid"/>
+          </w:tcPr>
+          <w:p>
+            <w:pPr>
+              <w:spacing w:after="60" w:before="60"/>
+            </w:pPr>
+            <w:r>
+              <w:rPr>
+                <w:color w:val="111827"/>
+                <w:sz w:val="22"/>
+                <w:szCs w:val="22"/>
+              </w:rPr>
+              <w:t xml:space="preserve">School name for younger students; job title or field for adults</w:t>
+            </w:r>
+          </w:p>
+        </w:tc>
+      </w:tr>
+      <w:tr>
+        <w:tc>
+          <w:tcPr>
+            <w:shd w:color="E8F2FA" w:val="solid"/>
+          </w:tcPr>
+          <w:p>
+            <w:pPr>
+              <w:spacing w:after="60" w:before="60"/>
+            </w:pPr>
+            <w:r>
+              <w:rPr>
+                <w:b/>
+                <w:bCs/>
+                <w:color w:val="02508E"/>
+                <w:sz w:val="20"/>
+                <w:szCs w:val="20"/>
+              </w:rPr>
+              <w:t xml:space="preserve">EIKEN Grade</w:t>
+            </w:r>
+          </w:p>
+        </w:tc>
+        <w:tc>
+          <w:tcPr>
+            <w:shd w:color="E8F2FA" w:val="solid"/>
+          </w:tcPr>
+          <w:p>
+            <w:pPr>
+              <w:spacing w:after="60" w:before="60"/>
+            </w:pPr>
+            <w:r>
+              <w:rPr>
+                <w:color w:val="111827"/>
+                <w:sz w:val="22"/>
+                <w:szCs w:val="22"/>
+              </w:rPr>
+              <w:t xml:space="preserve">Current EIKEN certification level (5級 through 1級)</w:t>
+            </w:r>
+          </w:p>
+        </w:tc>
+      </w:tr>
+      <w:tr>
+        <w:tc>
+          <w:tcPr>
+            <w:shd w:color="FFFFFF" w:val="solid"/>
+          </w:tcPr>
+          <w:p>
+            <w:pPr>
+              <w:spacing w:after="60" w:before="60"/>
+            </w:pPr>
+            <w:r>
+              <w:rPr>
+                <w:b/>
+                <w:bCs/>
+                <w:color w:val="02508E"/>
+                <w:sz w:val="20"/>
+                <w:szCs w:val="20"/>
+              </w:rPr>
+              <w:t xml:space="preserve">TOEIC / IELTS / TOEFL</w:t>
+            </w:r>
+          </w:p>
+        </w:tc>
+        <w:tc>
+          <w:tcPr>
+            <w:shd w:color="FFFFFF" w:val="solid"/>
+          </w:tcPr>
+          <w:p>
+            <w:pPr>
+              <w:spacing w:after="60" w:before="60"/>
+            </w:pPr>
+            <w:r>
+              <w:rPr>
+                <w:color w:val="111827"/>
+                <w:sz w:val="22"/>
+                <w:szCs w:val="22"/>
+              </w:rPr>
+              <w:t xml:space="preserve">Standardised test scores</w:t>
+            </w:r>
+          </w:p>
+        </w:tc>
+      </w:tr>
+      <w:tr>
+        <w:tc>
+          <w:tcPr>
+            <w:shd w:color="E8F2FA" w:val="solid"/>
+          </w:tcPr>
+          <w:p>
+            <w:pPr>
+              <w:spacing w:after="60" w:before="60"/>
+            </w:pPr>
+            <w:r>
+              <w:rPr>
+                <w:b/>
+                <w:bCs/>
+                <w:color w:val="02508E"/>
+                <w:sz w:val="20"/>
+                <w:szCs w:val="20"/>
+              </w:rPr>
+              <w:t xml:space="preserve">Self-assessed CEFR</w:t>
+            </w:r>
+          </w:p>
+        </w:tc>
+        <w:tc>
+          <w:tcPr>
+            <w:shd w:color="E8F2FA" w:val="solid"/>
+          </w:tcPr>
+          <w:p>
+            <w:pPr>
+              <w:spacing w:after="60" w:before="60"/>
+            </w:pPr>
+            <w:r>
+              <w:rPr>
+                <w:color w:val="111827"/>
+                <w:sz w:val="22"/>
+                <w:szCs w:val="22"/>
+              </w:rPr>
+              <w:t xml:space="preserve">The student's own estimate of their level (A1–C2)</w:t>
+            </w:r>
+          </w:p>
+        </w:tc>
+      </w:tr>
+      <w:tr>
+        <w:tc>
+          <w:tcPr>
+            <w:shd w:color="FFFFFF" w:val="solid"/>
+          </w:tcPr>
+          <w:p>
+            <w:pPr>
+              <w:spacing w:after="60" w:before="60"/>
+            </w:pPr>
+            <w:r>
+              <w:rPr>
+                <w:b/>
+                <w:bCs/>
+                <w:color w:val="02508E"/>
+                <w:sz w:val="20"/>
+                <w:szCs w:val="20"/>
+              </w:rPr>
+              <w:t xml:space="preserve">Hobbies &amp; Interests</w:t>
+            </w:r>
+          </w:p>
+        </w:tc>
+        <w:tc>
+          <w:tcPr>
+            <w:shd w:color="FFFFFF" w:val="solid"/>
+          </w:tcPr>
+          <w:p>
+            <w:pPr>
+              <w:spacing w:after="60" w:before="60"/>
+            </w:pPr>
+            <w:r>
+              <w:rPr>
+                <w:color w:val="111827"/>
+                <w:sz w:val="22"/>
+                <w:szCs w:val="22"/>
+              </w:rPr>
+              <w:t xml:space="preserve">Topics to use in conversation practice</w:t>
+            </w:r>
+          </w:p>
+        </w:tc>
+      </w:tr>
+      <w:tr>
+        <w:tc>
+          <w:tcPr>
+            <w:shd w:color="E8F2FA" w:val="solid"/>
+          </w:tcPr>
+          <w:p>
+            <w:pPr>
+              <w:spacing w:after="60" w:before="60"/>
+            </w:pPr>
+            <w:r>
+              <w:rPr>
+                <w:b/>
+                <w:bCs/>
+                <w:color w:val="02508E"/>
+                <w:sz w:val="20"/>
+                <w:szCs w:val="20"/>
+              </w:rPr>
+              <w:t xml:space="preserve">Likes / Dislikes</w:t>
+            </w:r>
+          </w:p>
+        </w:tc>
+        <w:tc>
+          <w:tcPr>
+            <w:shd w:color="E8F2FA" w:val="solid"/>
+          </w:tcPr>
+          <w:p>
+            <w:pPr>
+              <w:spacing w:after="60" w:before="60"/>
+            </w:pPr>
+            <w:r>
+              <w:rPr>
+                <w:color w:val="111827"/>
+                <w:sz w:val="22"/>
+                <w:szCs w:val="22"/>
+              </w:rPr>
+              <w:t xml:space="preserve">What the student enjoys or wants to avoid in lessons</w:t>
+            </w:r>
+          </w:p>
+        </w:tc>
+      </w:tr>
+      <w:tr>
+        <w:tc>
+          <w:tcPr>
+            <w:shd w:color="FFFFFF" w:val="solid"/>
+          </w:tcPr>
+          <w:p>
+            <w:pPr>
+              <w:spacing w:after="60" w:before="60"/>
+            </w:pPr>
+            <w:r>
+              <w:rPr>
+                <w:b/>
+                <w:bCs/>
+                <w:color w:val="02508E"/>
+                <w:sz w:val="20"/>
+                <w:szCs w:val="20"/>
+              </w:rPr>
+              <w:t xml:space="preserve">Learning Goals</w:t>
+            </w:r>
+          </w:p>
+        </w:tc>
+        <w:tc>
+          <w:tcPr>
+            <w:shd w:color="FFFFFF" w:val="solid"/>
+          </w:tcPr>
+          <w:p>
+            <w:pPr>
+              <w:spacing w:after="60" w:before="60"/>
+            </w:pPr>
+            <w:r>
+              <w:rPr>
+                <w:color w:val="111827"/>
+                <w:sz w:val="22"/>
+                <w:szCs w:val="22"/>
+              </w:rPr>
+              <w:t xml:space="preserve">Free-text description of what the student wants to achieve</w:t>
+            </w:r>
+          </w:p>
+        </w:tc>
+      </w:tr>
+      <w:tr>
+        <w:tc>
+          <w:tcPr>
+            <w:shd w:color="E8F2FA" w:val="solid"/>
+          </w:tcPr>
+          <w:p>
+            <w:pPr>
+              <w:spacing w:after="60" w:before="60"/>
+            </w:pPr>
+            <w:r>
+              <w:rPr>
+                <w:b/>
+                <w:bCs/>
+                <w:color w:val="02508E"/>
+                <w:sz w:val="20"/>
+                <w:szCs w:val="20"/>
+              </w:rPr>
+              <w:t xml:space="preserve">Notes</w:t>
+            </w:r>
+          </w:p>
+        </w:tc>
+        <w:tc>
+          <w:tcPr>
+            <w:shd w:color="E8F2FA" w:val="solid"/>
+          </w:tcPr>
+          <w:p>
+            <w:pPr>
+              <w:spacing w:after="60" w:before="60"/>
+            </w:pPr>
+            <w:r>
+              <w:rPr>
+                <w:color w:val="111827"/>
+                <w:sz w:val="22"/>
+                <w:szCs w:val="22"/>
+              </w:rPr>
+              <w:t xml:space="preserve">Private teacher notes about the student</w:t>
+            </w:r>
+          </w:p>
+        </w:tc>
+      </w:tr>
+    </w:tbl>
     <w:p>
       <w:pPr>
         <w:pStyle w:val="Heading3"/>
@@ -1367,79 +1754,61 @@
           <w:sz w:val="23"/>
           <w:szCs w:val="23"/>
         </w:rPr>
-        <w:t xml:space="preserve">Progress Assessment</w:t>
-      </w:r>
-    </w:p>
-    <w:p>
-      <w:pPr>
-        <w:pStyle w:val="ListParagraph"/>
-        <w:numPr>
-          <w:ilvl w:val="0"/>
-          <w:numId w:val="1"/>
-        </w:numPr>
-        <w:spacing w:after="80"/>
-      </w:pPr>
-      <w:r>
-        <w:rPr>
-          <w:color w:val="111827"/>
-          <w:sz w:val="22"/>
-          <w:szCs w:val="22"/>
-        </w:rPr>
-        <w:t xml:space="preserve">Skill scores for Speaking, Listening, Reading, and Writing (each rated 1–10)</w:t>
-      </w:r>
-    </w:p>
-    <w:p>
-      <w:pPr>
-        <w:pStyle w:val="ListParagraph"/>
-        <w:numPr>
-          <w:ilvl w:val="0"/>
-          <w:numId w:val="1"/>
-        </w:numPr>
-        <w:spacing w:after="80"/>
-      </w:pPr>
-      <w:r>
-        <w:rPr>
-          <w:color w:val="111827"/>
-          <w:sz w:val="22"/>
-          <w:szCs w:val="22"/>
-        </w:rPr>
-        <w:t xml:space="preserve">CEFR level badge (A1 through C2)</w:t>
-      </w:r>
-    </w:p>
-    <w:p>
-      <w:pPr>
-        <w:pStyle w:val="ListParagraph"/>
-        <w:numPr>
-          <w:ilvl w:val="0"/>
-          <w:numId w:val="1"/>
-        </w:numPr>
-        <w:spacing w:after="80"/>
-      </w:pPr>
-      <w:r>
-        <w:rPr>
-          <w:color w:val="111827"/>
-          <w:sz w:val="22"/>
-          <w:szCs w:val="22"/>
-        </w:rPr>
-        <w:t xml:space="preserve">Progress chart showing score changes across multiple assessment snapshots</w:t>
-      </w:r>
-    </w:p>
-    <w:p>
-      <w:pPr>
-        <w:pStyle w:val="ListParagraph"/>
-        <w:numPr>
-          <w:ilvl w:val="0"/>
-          <w:numId w:val="1"/>
-        </w:numPr>
-        <w:spacing w:after="80"/>
-      </w:pPr>
-      <w:r>
-        <w:rPr>
-          <w:color w:val="111827"/>
-          <w:sz w:val="22"/>
-          <w:szCs w:val="22"/>
-        </w:rPr>
-        <w:t xml:space="preserve">Record a new snapshot at any time</w:t>
+        <w:t xml:space="preserve">Goals</w:t>
+      </w:r>
+    </w:p>
+    <w:p>
+      <w:pPr>
+        <w:pStyle w:val="ListParagraph"/>
+        <w:numPr>
+          <w:ilvl w:val="0"/>
+          <w:numId w:val="1"/>
+        </w:numPr>
+        <w:spacing w:after="80"/>
+      </w:pPr>
+      <w:r>
+        <w:rPr>
+          <w:color w:val="111827"/>
+          <w:sz w:val="22"/>
+          <w:szCs w:val="22"/>
+        </w:rPr>
+        <w:t xml:space="preserve">Full list of learning goals with title, target date, days remaining (or overdue), and status</w:t>
+      </w:r>
+    </w:p>
+    <w:p>
+      <w:pPr>
+        <w:pStyle w:val="ListParagraph"/>
+        <w:numPr>
+          <w:ilvl w:val="0"/>
+          <w:numId w:val="1"/>
+        </w:numPr>
+        <w:spacing w:after="80"/>
+      </w:pPr>
+      <w:r>
+        <w:rPr>
+          <w:color w:val="111827"/>
+          <w:sz w:val="22"/>
+          <w:szCs w:val="22"/>
+        </w:rPr>
+        <w:t xml:space="preserve">Status options: Active / Achieved / Paused / Dropped</w:t>
+      </w:r>
+    </w:p>
+    <w:p>
+      <w:pPr>
+        <w:pStyle w:val="ListParagraph"/>
+        <w:numPr>
+          <w:ilvl w:val="0"/>
+          <w:numId w:val="1"/>
+        </w:numPr>
+        <w:spacing w:after="80"/>
+      </w:pPr>
+      <w:r>
+        <w:rPr>
+          <w:color w:val="111827"/>
+          <w:sz w:val="22"/>
+          <w:szCs w:val="22"/>
+        </w:rPr>
+        <w:t xml:space="preserve">Add new goals with title, optional description, and optional target date</w:t>
       </w:r>
     </w:p>
     <w:p>
@@ -1457,97 +1826,79 @@
           <w:sz w:val="23"/>
           <w:szCs w:val="23"/>
         </w:rPr>
-        <w:t xml:space="preserve">Vocabulary Bank</w:t>
-      </w:r>
-    </w:p>
-    <w:p>
-      <w:pPr>
-        <w:pStyle w:val="ListParagraph"/>
-        <w:numPr>
-          <w:ilvl w:val="0"/>
-          <w:numId w:val="1"/>
-        </w:numPr>
-        <w:spacing w:after="80"/>
-      </w:pPr>
-      <w:r>
-        <w:rPr>
-          <w:color w:val="111827"/>
-          <w:sz w:val="22"/>
-          <w:szCs w:val="22"/>
-        </w:rPr>
-        <w:t xml:space="preserve">Complete list of all vocabulary words for this student</w:t>
-      </w:r>
-    </w:p>
-    <w:p>
-      <w:pPr>
-        <w:pStyle w:val="ListParagraph"/>
-        <w:numPr>
-          <w:ilvl w:val="0"/>
-          <w:numId w:val="1"/>
-        </w:numPr>
-        <w:spacing w:after="80"/>
-      </w:pPr>
-      <w:r>
-        <w:rPr>
-          <w:color w:val="111827"/>
-          <w:sz w:val="22"/>
-          <w:szCs w:val="22"/>
-        </w:rPr>
-        <w:t xml:space="preserve">Shows word, English definition, Japanese definition, example sentence, and mastery level</w:t>
-      </w:r>
-    </w:p>
-    <w:p>
-      <w:pPr>
-        <w:pStyle w:val="ListParagraph"/>
-        <w:numPr>
-          <w:ilvl w:val="0"/>
-          <w:numId w:val="1"/>
-        </w:numPr>
-        <w:spacing w:after="80"/>
-      </w:pPr>
-      <w:r>
-        <w:rPr>
-          <w:color w:val="111827"/>
-          <w:sz w:val="22"/>
-          <w:szCs w:val="22"/>
-        </w:rPr>
-        <w:t xml:space="preserve">Add new words directly — no lesson required</w:t>
-      </w:r>
-    </w:p>
-    <w:p>
-      <w:pPr>
-        <w:pStyle w:val="ListParagraph"/>
-        <w:numPr>
-          <w:ilvl w:val="0"/>
-          <w:numId w:val="1"/>
-        </w:numPr>
-        <w:spacing w:after="80"/>
-      </w:pPr>
-      <w:r>
-        <w:rPr>
-          <w:color w:val="111827"/>
-          <w:sz w:val="22"/>
-          <w:szCs w:val="22"/>
-        </w:rPr>
-        <w:t xml:space="preserve">Remove individual words</w:t>
-      </w:r>
-    </w:p>
-    <w:p>
-      <w:pPr>
-        <w:pStyle w:val="ListParagraph"/>
-        <w:numPr>
-          <w:ilvl w:val="0"/>
-          <w:numId w:val="1"/>
-        </w:numPr>
-        <w:spacing w:after="80"/>
-      </w:pPr>
-      <w:r>
-        <w:rPr>
-          <w:color w:val="111827"/>
-          <w:sz w:val="22"/>
-          <w:szCs w:val="22"/>
-        </w:rPr>
-        <w:t xml:space="preserve">Words appear immediately in the student's Vocabulary page</w:t>
+        <w:t xml:space="preserve">Progress Assessment</w:t>
+      </w:r>
+    </w:p>
+    <w:p>
+      <w:pPr>
+        <w:pStyle w:val="ListParagraph"/>
+        <w:numPr>
+          <w:ilvl w:val="0"/>
+          <w:numId w:val="1"/>
+        </w:numPr>
+        <w:spacing w:after="80"/>
+      </w:pPr>
+      <w:r>
+        <w:rPr>
+          <w:color w:val="111827"/>
+          <w:sz w:val="22"/>
+          <w:szCs w:val="22"/>
+        </w:rPr>
+        <w:t xml:space="preserve">Skill scores for Speaking, Listening, Reading, and Writing (each rated 1–10)</w:t>
+      </w:r>
+    </w:p>
+    <w:p>
+      <w:pPr>
+        <w:pStyle w:val="ListParagraph"/>
+        <w:numPr>
+          <w:ilvl w:val="0"/>
+          <w:numId w:val="1"/>
+        </w:numPr>
+        <w:spacing w:after="80"/>
+      </w:pPr>
+      <w:r>
+        <w:rPr>
+          <w:color w:val="111827"/>
+          <w:sz w:val="22"/>
+          <w:szCs w:val="22"/>
+        </w:rPr>
+        <w:t xml:space="preserve">CEFR level badge (A1 through C2)</w:t>
+      </w:r>
+    </w:p>
+    <w:p>
+      <w:pPr>
+        <w:pStyle w:val="ListParagraph"/>
+        <w:numPr>
+          <w:ilvl w:val="0"/>
+          <w:numId w:val="1"/>
+        </w:numPr>
+        <w:spacing w:after="80"/>
+      </w:pPr>
+      <w:r>
+        <w:rPr>
+          <w:color w:val="111827"/>
+          <w:sz w:val="22"/>
+          <w:szCs w:val="22"/>
+        </w:rPr>
+        <w:t xml:space="preserve">Progress chart showing score changes across multiple assessment snapshots</w:t>
+      </w:r>
+    </w:p>
+    <w:p>
+      <w:pPr>
+        <w:pStyle w:val="ListParagraph"/>
+        <w:numPr>
+          <w:ilvl w:val="0"/>
+          <w:numId w:val="1"/>
+        </w:numPr>
+        <w:spacing w:after="80"/>
+      </w:pPr>
+      <w:r>
+        <w:rPr>
+          <w:color w:val="111827"/>
+          <w:sz w:val="22"/>
+          <w:szCs w:val="22"/>
+        </w:rPr>
+        <w:t xml:space="preserve">Record a new snapshot at any time</w:t>
       </w:r>
     </w:p>
     <w:p>
@@ -1565,108 +1916,97 @@
           <w:sz w:val="23"/>
           <w:szCs w:val="23"/>
         </w:rPr>
-        <w:t xml:space="preserve">Recent Lessons</w:t>
-      </w:r>
-    </w:p>
-    <w:p>
-      <w:pPr>
-        <w:pStyle w:val="ListParagraph"/>
-        <w:numPr>
-          <w:ilvl w:val="0"/>
-          <w:numId w:val="1"/>
-        </w:numPr>
-        <w:spacing w:after="80"/>
-      </w:pPr>
-      <w:r>
-        <w:rPr>
-          <w:color w:val="111827"/>
-          <w:sz w:val="22"/>
-          <w:szCs w:val="22"/>
-        </w:rPr>
-        <w:t xml:space="preserve">The 10 most recent lessons with date, time, status, and link to full lesson notes</w:t>
-      </w:r>
-    </w:p>
-    <w:p>
-      <w:pPr>
-        <w:pStyle w:val="Heading2"/>
-        <w:spacing w:after="120" w:before="300"/>
-      </w:pPr>
-      <w:r>
-        <w:rPr>
-          <w:b/>
-          <w:bCs/>
-          <w:color w:val="111827"/>
-          <w:sz w:val="26"/>
-          <w:szCs w:val="26"/>
-        </w:rPr>
-        <w:t xml:space="preserve">Lessons</w:t>
-      </w:r>
-    </w:p>
-    <w:p>
-      <w:pPr>
-        <w:spacing w:after="120"/>
-      </w:pPr>
-      <w:r>
-        <w:rPr>
-          <w:color w:val="111827"/>
-          <w:sz w:val="22"/>
-          <w:szCs w:val="22"/>
-        </w:rPr>
-        <w:t xml:space="preserve">A timeline of all lessons organised by student. Select a student from the sidebar to see their full lesson history. From here you can:</w:t>
-      </w:r>
-    </w:p>
-    <w:p>
-      <w:pPr>
-        <w:pStyle w:val="ListParagraph"/>
-        <w:numPr>
-          <w:ilvl w:val="0"/>
-          <w:numId w:val="1"/>
-        </w:numPr>
-        <w:spacing w:after="80"/>
-      </w:pPr>
-      <w:r>
-        <w:rPr>
-          <w:color w:val="111827"/>
-          <w:sz w:val="22"/>
-          <w:szCs w:val="22"/>
-        </w:rPr>
-        <w:t xml:space="preserve">See total, completed, and upcoming lesson counts</w:t>
-      </w:r>
-    </w:p>
-    <w:p>
-      <w:pPr>
-        <w:pStyle w:val="ListParagraph"/>
-        <w:numPr>
-          <w:ilvl w:val="0"/>
-          <w:numId w:val="1"/>
-        </w:numPr>
-        <w:spacing w:after="80"/>
-      </w:pPr>
-      <w:r>
-        <w:rPr>
-          <w:color w:val="111827"/>
-          <w:sz w:val="22"/>
-          <w:szCs w:val="22"/>
-        </w:rPr>
-        <w:t xml:space="preserve">Open any lesson to view or edit notes</w:t>
-      </w:r>
-    </w:p>
-    <w:p>
-      <w:pPr>
-        <w:pStyle w:val="ListParagraph"/>
-        <w:numPr>
-          <w:ilvl w:val="0"/>
-          <w:numId w:val="1"/>
-        </w:numPr>
-        <w:spacing w:after="80"/>
-      </w:pPr>
-      <w:r>
-        <w:rPr>
-          <w:color w:val="111827"/>
-          <w:sz w:val="22"/>
-          <w:szCs w:val="22"/>
-        </w:rPr>
-        <w:t xml:space="preserve">Use "+ Log Lesson" to schedule a new lesson or record a past one</w:t>
+        <w:t xml:space="preserve">Vocabulary Bank</w:t>
+      </w:r>
+    </w:p>
+    <w:p>
+      <w:pPr>
+        <w:pStyle w:val="ListParagraph"/>
+        <w:numPr>
+          <w:ilvl w:val="0"/>
+          <w:numId w:val="1"/>
+        </w:numPr>
+        <w:spacing w:after="80"/>
+      </w:pPr>
+      <w:r>
+        <w:rPr>
+          <w:color w:val="111827"/>
+          <w:sz w:val="22"/>
+          <w:szCs w:val="22"/>
+        </w:rPr>
+        <w:t xml:space="preserve">Complete list of all vocabulary words for this student</w:t>
+      </w:r>
+    </w:p>
+    <w:p>
+      <w:pPr>
+        <w:pStyle w:val="ListParagraph"/>
+        <w:numPr>
+          <w:ilvl w:val="0"/>
+          <w:numId w:val="1"/>
+        </w:numPr>
+        <w:spacing w:after="80"/>
+      </w:pPr>
+      <w:r>
+        <w:rPr>
+          <w:color w:val="111827"/>
+          <w:sz w:val="22"/>
+          <w:szCs w:val="22"/>
+        </w:rPr>
+        <w:t xml:space="preserve">Shows word, English definition, Japanese definition, example sentence, and mastery level</w:t>
+      </w:r>
+    </w:p>
+    <w:p>
+      <w:pPr>
+        <w:pStyle w:val="ListParagraph"/>
+        <w:numPr>
+          <w:ilvl w:val="0"/>
+          <w:numId w:val="1"/>
+        </w:numPr>
+        <w:spacing w:after="80"/>
+      </w:pPr>
+      <w:r>
+        <w:rPr>
+          <w:color w:val="111827"/>
+          <w:sz w:val="22"/>
+          <w:szCs w:val="22"/>
+        </w:rPr>
+        <w:t xml:space="preserve">Add new words directly — no lesson required</w:t>
+      </w:r>
+    </w:p>
+    <w:p>
+      <w:pPr>
+        <w:pStyle w:val="ListParagraph"/>
+        <w:numPr>
+          <w:ilvl w:val="0"/>
+          <w:numId w:val="1"/>
+        </w:numPr>
+        <w:spacing w:after="80"/>
+      </w:pPr>
+      <w:r>
+        <w:rPr>
+          <w:color w:val="111827"/>
+          <w:sz w:val="22"/>
+          <w:szCs w:val="22"/>
+        </w:rPr>
+        <w:t xml:space="preserve">Remove individual words</w:t>
+      </w:r>
+    </w:p>
+    <w:p>
+      <w:pPr>
+        <w:pStyle w:val="ListParagraph"/>
+        <w:numPr>
+          <w:ilvl w:val="0"/>
+          <w:numId w:val="1"/>
+        </w:numPr>
+        <w:spacing w:after="80"/>
+      </w:pPr>
+      <w:r>
+        <w:rPr>
+          <w:color w:val="111827"/>
+          <w:sz w:val="22"/>
+          <w:szCs w:val="22"/>
+        </w:rPr>
+        <w:t xml:space="preserve">Words appear immediately in the student's Vocabulary page</w:t>
       </w:r>
     </w:p>
     <w:p>
@@ -1684,7 +2024,59 @@
           <w:sz w:val="23"/>
           <w:szCs w:val="23"/>
         </w:rPr>
-        <w:t xml:space="preserve">Logging a Lesson</w:t>
+        <w:t xml:space="preserve">Recent Lessons</w:t>
+      </w:r>
+    </w:p>
+    <w:p>
+      <w:pPr>
+        <w:pStyle w:val="ListParagraph"/>
+        <w:numPr>
+          <w:ilvl w:val="0"/>
+          <w:numId w:val="1"/>
+        </w:numPr>
+        <w:spacing w:after="80"/>
+      </w:pPr>
+      <w:r>
+        <w:rPr>
+          <w:color w:val="111827"/>
+          <w:sz w:val="22"/>
+          <w:szCs w:val="22"/>
+        </w:rPr>
+        <w:t xml:space="preserve">The 10 most recent lessons with date, time, status, and link to full lesson notes</w:t>
+      </w:r>
+    </w:p>
+    <w:p>
+      <w:pPr>
+        <w:pStyle w:val="ListParagraph"/>
+        <w:numPr>
+          <w:ilvl w:val="0"/>
+          <w:numId w:val="1"/>
+        </w:numPr>
+        <w:spacing w:after="80"/>
+      </w:pPr>
+      <w:r>
+        <w:rPr>
+          <w:color w:val="111827"/>
+          <w:sz w:val="22"/>
+          <w:szCs w:val="22"/>
+        </w:rPr>
+        <w:t xml:space="preserve">Use the "+ Add Lesson" button here to schedule a new lesson or log a past one directly from the student's profile</w:t>
+      </w:r>
+    </w:p>
+    <w:p>
+      <w:pPr>
+        <w:pStyle w:val="Heading2"/>
+        <w:spacing w:after="120" w:before="300"/>
+      </w:pPr>
+      <w:r>
+        <w:rPr>
+          <w:b/>
+          <w:bCs/>
+          <w:color w:val="111827"/>
+          <w:sz w:val="26"/>
+          <w:szCs w:val="26"/>
+        </w:rPr>
+        <w:t xml:space="preserve">Lessons</w:t>
       </w:r>
     </w:p>
     <w:p>
@@ -1697,7 +2089,166 @@
           <w:sz w:val="22"/>
           <w:szCs w:val="22"/>
         </w:rPr>
-        <w:t xml:space="preserve">The "Log Lesson" modal lets you record a past lesson or schedule a future one. All times are entered in Japan Standard Time (JST).</w:t>
+        <w:t xml:space="preserve">A timeline of all lessons organised by student. Select a student from the sidebar to see their full lesson history. From here you can:</w:t>
+      </w:r>
+    </w:p>
+    <w:p>
+      <w:pPr>
+        <w:pStyle w:val="ListParagraph"/>
+        <w:numPr>
+          <w:ilvl w:val="0"/>
+          <w:numId w:val="1"/>
+        </w:numPr>
+        <w:spacing w:after="80"/>
+      </w:pPr>
+      <w:r>
+        <w:rPr>
+          <w:color w:val="111827"/>
+          <w:sz w:val="22"/>
+          <w:szCs w:val="22"/>
+        </w:rPr>
+        <w:t xml:space="preserve">See total, completed, and upcoming lesson counts</w:t>
+      </w:r>
+    </w:p>
+    <w:p>
+      <w:pPr>
+        <w:pStyle w:val="ListParagraph"/>
+        <w:numPr>
+          <w:ilvl w:val="0"/>
+          <w:numId w:val="1"/>
+        </w:numPr>
+        <w:spacing w:after="80"/>
+      </w:pPr>
+      <w:r>
+        <w:rPr>
+          <w:color w:val="111827"/>
+          <w:sz w:val="22"/>
+          <w:szCs w:val="22"/>
+        </w:rPr>
+        <w:t xml:space="preserve">Open any lesson to view or edit notes</w:t>
+      </w:r>
+    </w:p>
+    <w:p>
+      <w:pPr>
+        <w:pStyle w:val="ListParagraph"/>
+        <w:numPr>
+          <w:ilvl w:val="0"/>
+          <w:numId w:val="1"/>
+        </w:numPr>
+        <w:spacing w:after="80"/>
+      </w:pPr>
+      <w:r>
+        <w:rPr>
+          <w:color w:val="111827"/>
+          <w:sz w:val="22"/>
+          <w:szCs w:val="22"/>
+        </w:rPr>
+        <w:t xml:space="preserve">Use "+ Add Lesson" to schedule a new lesson or record a past one</w:t>
+      </w:r>
+    </w:p>
+    <w:p>
+      <w:pPr>
+        <w:spacing w:after="80"/>
+      </w:pPr>
+    </w:p>
+    <w:tbl>
+      <w:tblPr>
+        <w:tblW w:type="pct" w:w="100%"/>
+        <w:tblBorders>
+          <w:top w:val="single" w:color="auto" w:sz="4"/>
+          <w:left w:val="single" w:color="auto" w:sz="4"/>
+          <w:bottom w:val="single" w:color="auto" w:sz="4"/>
+          <w:right w:val="single" w:color="auto" w:sz="4"/>
+          <w:insideH w:val="single" w:color="auto" w:sz="4"/>
+          <w:insideV w:val="single" w:color="auto" w:sz="4"/>
+        </w:tblBorders>
+        <w:tblCellMar>
+          <w:top w:type="dxa" w:w="100"/>
+          <w:bottom w:type="dxa" w:w="200"/>
+        </w:tblCellMar>
+      </w:tblPr>
+      <w:tblGrid>
+        <w:gridCol w:w="100"/>
+        <w:gridCol w:w="100"/>
+      </w:tblGrid>
+      <w:tr>
+        <w:tc>
+          <w:tcPr>
+            <w:tcW w:type="pct" w:w="15%"/>
+            <w:shd w:color="02508E" w:val="solid"/>
+          </w:tcPr>
+          <w:p>
+            <w:pPr>
+              <w:spacing w:after="80" w:before="80"/>
+              <w:jc w:val="center"/>
+            </w:pPr>
+            <w:r>
+              <w:rPr>
+                <w:b/>
+                <w:bCs/>
+                <w:color w:val="FFFFFF"/>
+                <w:sz w:val="20"/>
+                <w:szCs w:val="20"/>
+              </w:rPr>
+              <w:t xml:space="preserve">Teacher Tip</w:t>
+            </w:r>
+          </w:p>
+        </w:tc>
+        <w:tc>
+          <w:tcPr>
+            <w:tcW w:type="pct" w:w="85%"/>
+            <w:shd w:color="E8F2FA" w:val="solid"/>
+          </w:tcPr>
+          <w:p>
+            <w:pPr>
+              <w:spacing w:after="60" w:before="60"/>
+            </w:pPr>
+            <w:r>
+              <w:rPr>
+                <w:color w:val="111827"/>
+                <w:sz w:val="22"/>
+                <w:szCs w:val="22"/>
+              </w:rPr>
+              <w:t xml:space="preserve">You can also schedule a lesson directly from a student's profile page — the "+ Add Lesson" button appears in the Recent Lessons section, so you don't have to navigate to the Lessons page first.</w:t>
+            </w:r>
+          </w:p>
+        </w:tc>
+      </w:tr>
+    </w:tbl>
+    <w:p>
+      <w:pPr>
+        <w:spacing w:after="120"/>
+      </w:pPr>
+    </w:p>
+    <w:p>
+      <w:pPr>
+        <w:pStyle w:val="Heading3"/>
+        <w:spacing w:after="80" w:before="200"/>
+      </w:pPr>
+      <w:r>
+        <w:rPr>
+          <w:b/>
+          <w:bCs/>
+          <w:i/>
+          <w:iCs/>
+          <w:color w:val="02508E"/>
+          <w:sz w:val="23"/>
+          <w:szCs w:val="23"/>
+        </w:rPr>
+        <w:t xml:space="preserve">Adding a Lesson</w:t>
+      </w:r>
+    </w:p>
+    <w:p>
+      <w:pPr>
+        <w:spacing w:after="120"/>
+      </w:pPr>
+      <w:r>
+        <w:rPr>
+          <w:color w:val="111827"/>
+          <w:sz w:val="22"/>
+          <w:szCs w:val="22"/>
+        </w:rPr>
+        <w:t xml:space="preserve">The "+ Add Lesson" button opens a modal where you can schedule an upcoming lesson or record a past one. All times are entered in Japan Standard Time (JST).</w:t>
       </w:r>
     </w:p>
     <w:tbl>

</xml_diff>